<commit_message>
Use first person singular in README and report
</commit_message>
<xml_diff>
--- a/report/ScamShield_Report.docx
+++ b/report/ScamShield_Report.docx
@@ -99,7 +99,7 @@
         <w:pStyle w:val="Heading1"/>
         <w:pageBreakBefore/>
       </w:pPr>
-      <w:bookmarkStart w:id="0" w:name="_Toc241297729"/>
+      <w:bookmarkStart w:id="0" w:name="_Toc241303886"/>
       <w:r>
         <w:lastRenderedPageBreak/>
         <w:t>Abstract</w:t>
@@ -112,10 +112,10 @@
         <w:jc w:val="both"/>
       </w:pPr>
       <w:r>
-        <w:t>Scam SMS in India exploit UPI payments, KYC updates, courier fees and impersonated police officers, yet the public datasets used to train spam filters are dominated by English messages collected in the UK around 2012. ScamShield studies what happens when such filters meet Indian messages, how easily they are evaded by simple character obfuscation, and how to make their verdicts explainable. We assemble a 6,061-message Indian test set from two public Indian SMS datasets and published fraud reports, train eig</w:t>
+        <w:t>Scam SMS in India exploit UPI payments, KYC updates, courier fees and impersonated police officers, yet the public datasets used to train spam filters are dominated by English messages collected in the UK around 2012. ScamShield studies what happens when such filters meet Indian messages, how easily they are evaded by simple character obfuscation, and how to make their verdicts explainable. I assemble a 6,061-message Indian test set from two public Indian SMS datasets and published fraud reports, train eigh</w:t>
       </w:r>
       <w:r>
-        <w:t>ht models (Naive Bayes, logistic regression and linear SVM on TF-IDF; a simple RNN and a BiLSTM, each with and without attention; and DistilBERT), and evaluate them in seven experiments.</w:t>
+        <w:t>t models (Naive Bayes, logistic regression and linear SVM on TF-IDF; a simple RNN and a BiLSTM, each with and without attention; and DistilBERT), and evaluate them in seven experiments.</w:t>
       </w:r>
     </w:p>
     <w:p>
@@ -151,7 +151,7 @@
         <w:pStyle w:val="Heading1"/>
         <w:pageBreakBefore/>
       </w:pPr>
-      <w:bookmarkStart w:id="1" w:name="_Toc241297730"/>
+      <w:bookmarkStart w:id="1" w:name="_Toc241303887"/>
       <w:r>
         <w:lastRenderedPageBreak/>
         <w:t>Contents</w:t>
@@ -161,7 +161,7 @@
     <w:sdt>
       <w:sdtPr>
         <w:alias w:val="Contents"/>
-        <w:id w:val="1127124511"/>
+        <w:id w:val="-719744723"/>
       </w:sdtPr>
       <w:sdtEndPr/>
       <w:sdtContent>
@@ -188,7 +188,7 @@
           <w:r>
             <w:fldChar w:fldCharType="separate"/>
           </w:r>
-          <w:hyperlink w:anchor="_Toc241297729" w:history="1">
+          <w:hyperlink w:anchor="_Toc241303886" w:history="1">
             <w:r>
               <w:rPr>
                 <w:rStyle w:val="Hyperlink"/>
@@ -212,7 +212,7 @@
               <w:rPr>
                 <w:noProof/>
               </w:rPr>
-              <w:instrText xml:space="preserve"> PAGEREF _Toc241297729 \h </w:instrText>
+              <w:instrText xml:space="preserve"> PAGEREF _Toc241303886 \h </w:instrText>
             </w:r>
             <w:r>
               <w:rPr>
@@ -253,7 +253,7 @@
               <w14:ligatures w14:val="standardContextual"/>
             </w:rPr>
           </w:pPr>
-          <w:hyperlink w:anchor="_Toc241297730" w:history="1">
+          <w:hyperlink w:anchor="_Toc241303887" w:history="1">
             <w:r>
               <w:rPr>
                 <w:rStyle w:val="Hyperlink"/>
@@ -277,7 +277,7 @@
               <w:rPr>
                 <w:noProof/>
               </w:rPr>
-              <w:instrText xml:space="preserve"> PAGEREF _Toc241297730 \h </w:instrText>
+              <w:instrText xml:space="preserve"> PAGEREF _Toc241303887 \h </w:instrText>
             </w:r>
             <w:r>
               <w:rPr>
@@ -318,7 +318,7 @@
               <w14:ligatures w14:val="standardContextual"/>
             </w:rPr>
           </w:pPr>
-          <w:hyperlink w:anchor="_Toc241297731" w:history="1">
+          <w:hyperlink w:anchor="_Toc241303888" w:history="1">
             <w:r>
               <w:rPr>
                 <w:rStyle w:val="Hyperlink"/>
@@ -342,7 +342,7 @@
               <w:rPr>
                 <w:noProof/>
               </w:rPr>
-              <w:instrText xml:space="preserve"> PAGEREF _Toc241297731 \h </w:instrText>
+              <w:instrText xml:space="preserve"> PAGEREF _Toc241303888 \h </w:instrText>
             </w:r>
             <w:r>
               <w:rPr>
@@ -383,7 +383,7 @@
               <w14:ligatures w14:val="standardContextual"/>
             </w:rPr>
           </w:pPr>
-          <w:hyperlink w:anchor="_Toc241297732" w:history="1">
+          <w:hyperlink w:anchor="_Toc241303889" w:history="1">
             <w:r>
               <w:rPr>
                 <w:rStyle w:val="Hyperlink"/>
@@ -407,7 +407,7 @@
               <w:rPr>
                 <w:noProof/>
               </w:rPr>
-              <w:instrText xml:space="preserve"> PAGEREF _Toc241297732 \h </w:instrText>
+              <w:instrText xml:space="preserve"> PAGEREF _Toc241303889 \h </w:instrText>
             </w:r>
             <w:r>
               <w:rPr>
@@ -448,7 +448,7 @@
               <w14:ligatures w14:val="standardContextual"/>
             </w:rPr>
           </w:pPr>
-          <w:hyperlink w:anchor="_Toc241297733" w:history="1">
+          <w:hyperlink w:anchor="_Toc241303890" w:history="1">
             <w:r>
               <w:rPr>
                 <w:rStyle w:val="Hyperlink"/>
@@ -472,7 +472,7 @@
               <w:rPr>
                 <w:noProof/>
               </w:rPr>
-              <w:instrText xml:space="preserve"> PAGEREF _Toc241297733 \h </w:instrText>
+              <w:instrText xml:space="preserve"> PAGEREF _Toc241303890 \h </w:instrText>
             </w:r>
             <w:r>
               <w:rPr>
@@ -513,7 +513,7 @@
               <w14:ligatures w14:val="standardContextual"/>
             </w:rPr>
           </w:pPr>
-          <w:hyperlink w:anchor="_Toc241297734" w:history="1">
+          <w:hyperlink w:anchor="_Toc241303891" w:history="1">
             <w:r>
               <w:rPr>
                 <w:rStyle w:val="Hyperlink"/>
@@ -537,7 +537,7 @@
               <w:rPr>
                 <w:noProof/>
               </w:rPr>
-              <w:instrText xml:space="preserve"> PAGEREF _Toc241297734 \h </w:instrText>
+              <w:instrText xml:space="preserve"> PAGEREF _Toc241303891 \h </w:instrText>
             </w:r>
             <w:r>
               <w:rPr>
@@ -578,7 +578,7 @@
               <w14:ligatures w14:val="standardContextual"/>
             </w:rPr>
           </w:pPr>
-          <w:hyperlink w:anchor="_Toc241297735" w:history="1">
+          <w:hyperlink w:anchor="_Toc241303892" w:history="1">
             <w:r>
               <w:rPr>
                 <w:rStyle w:val="Hyperlink"/>
@@ -602,7 +602,7 @@
               <w:rPr>
                 <w:noProof/>
               </w:rPr>
-              <w:instrText xml:space="preserve"> PAGEREF _Toc241297735 \h </w:instrText>
+              <w:instrText xml:space="preserve"> PAGEREF _Toc241303892 \h </w:instrText>
             </w:r>
             <w:r>
               <w:rPr>
@@ -643,7 +643,7 @@
               <w14:ligatures w14:val="standardContextual"/>
             </w:rPr>
           </w:pPr>
-          <w:hyperlink w:anchor="_Toc241297736" w:history="1">
+          <w:hyperlink w:anchor="_Toc241303893" w:history="1">
             <w:r>
               <w:rPr>
                 <w:rStyle w:val="Hyperlink"/>
@@ -667,7 +667,7 @@
               <w:rPr>
                 <w:noProof/>
               </w:rPr>
-              <w:instrText xml:space="preserve"> PAGEREF _Toc241297736 \h </w:instrText>
+              <w:instrText xml:space="preserve"> PAGEREF _Toc241303893 \h </w:instrText>
             </w:r>
             <w:r>
               <w:rPr>
@@ -708,7 +708,7 @@
               <w14:ligatures w14:val="standardContextual"/>
             </w:rPr>
           </w:pPr>
-          <w:hyperlink w:anchor="_Toc241297737" w:history="1">
+          <w:hyperlink w:anchor="_Toc241303894" w:history="1">
             <w:r>
               <w:rPr>
                 <w:rStyle w:val="Hyperlink"/>
@@ -732,7 +732,7 @@
               <w:rPr>
                 <w:noProof/>
               </w:rPr>
-              <w:instrText xml:space="preserve"> PAGEREF _Toc241297737 \h </w:instrText>
+              <w:instrText xml:space="preserve"> PAGEREF _Toc241303894 \h </w:instrText>
             </w:r>
             <w:r>
               <w:rPr>
@@ -773,7 +773,7 @@
               <w14:ligatures w14:val="standardContextual"/>
             </w:rPr>
           </w:pPr>
-          <w:hyperlink w:anchor="_Toc241297738" w:history="1">
+          <w:hyperlink w:anchor="_Toc241303895" w:history="1">
             <w:r>
               <w:rPr>
                 <w:rStyle w:val="Hyperlink"/>
@@ -797,7 +797,7 @@
               <w:rPr>
                 <w:noProof/>
               </w:rPr>
-              <w:instrText xml:space="preserve"> PAGEREF _Toc241297738 \h </w:instrText>
+              <w:instrText xml:space="preserve"> PAGEREF _Toc241303895 \h </w:instrText>
             </w:r>
             <w:r>
               <w:rPr>
@@ -838,7 +838,7 @@
               <w14:ligatures w14:val="standardContextual"/>
             </w:rPr>
           </w:pPr>
-          <w:hyperlink w:anchor="_Toc241297739" w:history="1">
+          <w:hyperlink w:anchor="_Toc241303896" w:history="1">
             <w:r>
               <w:rPr>
                 <w:rStyle w:val="Hyperlink"/>
@@ -862,7 +862,7 @@
               <w:rPr>
                 <w:noProof/>
               </w:rPr>
-              <w:instrText xml:space="preserve"> PAGEREF _Toc241297739 \h </w:instrText>
+              <w:instrText xml:space="preserve"> PAGEREF _Toc241303896 \h </w:instrText>
             </w:r>
             <w:r>
               <w:rPr>
@@ -903,7 +903,7 @@
               <w14:ligatures w14:val="standardContextual"/>
             </w:rPr>
           </w:pPr>
-          <w:hyperlink w:anchor="_Toc241297740" w:history="1">
+          <w:hyperlink w:anchor="_Toc241303897" w:history="1">
             <w:r>
               <w:rPr>
                 <w:rStyle w:val="Hyperlink"/>
@@ -927,7 +927,7 @@
               <w:rPr>
                 <w:noProof/>
               </w:rPr>
-              <w:instrText xml:space="preserve"> PAGEREF _Toc241297740 \h </w:instrText>
+              <w:instrText xml:space="preserve"> PAGEREF _Toc241303897 \h </w:instrText>
             </w:r>
             <w:r>
               <w:rPr>
@@ -968,7 +968,7 @@
               <w14:ligatures w14:val="standardContextual"/>
             </w:rPr>
           </w:pPr>
-          <w:hyperlink w:anchor="_Toc241297741" w:history="1">
+          <w:hyperlink w:anchor="_Toc241303898" w:history="1">
             <w:r>
               <w:rPr>
                 <w:rStyle w:val="Hyperlink"/>
@@ -992,7 +992,7 @@
               <w:rPr>
                 <w:noProof/>
               </w:rPr>
-              <w:instrText xml:space="preserve"> PAGEREF _Toc241297741 \h </w:instrText>
+              <w:instrText xml:space="preserve"> PAGEREF _Toc241303898 \h </w:instrText>
             </w:r>
             <w:r>
               <w:rPr>
@@ -1033,7 +1033,7 @@
               <w14:ligatures w14:val="standardContextual"/>
             </w:rPr>
           </w:pPr>
-          <w:hyperlink w:anchor="_Toc241297742" w:history="1">
+          <w:hyperlink w:anchor="_Toc241303899" w:history="1">
             <w:r>
               <w:rPr>
                 <w:rStyle w:val="Hyperlink"/>
@@ -1057,7 +1057,7 @@
               <w:rPr>
                 <w:noProof/>
               </w:rPr>
-              <w:instrText xml:space="preserve"> PAGEREF _Toc241297742 \h </w:instrText>
+              <w:instrText xml:space="preserve"> PAGEREF _Toc241303899 \h </w:instrText>
             </w:r>
             <w:r>
               <w:rPr>
@@ -1098,7 +1098,7 @@
               <w14:ligatures w14:val="standardContextual"/>
             </w:rPr>
           </w:pPr>
-          <w:hyperlink w:anchor="_Toc241297743" w:history="1">
+          <w:hyperlink w:anchor="_Toc241303900" w:history="1">
             <w:r>
               <w:rPr>
                 <w:rStyle w:val="Hyperlink"/>
@@ -1122,7 +1122,7 @@
               <w:rPr>
                 <w:noProof/>
               </w:rPr>
-              <w:instrText xml:space="preserve"> PAGEREF _Toc241297743 \h </w:instrText>
+              <w:instrText xml:space="preserve"> PAGEREF _Toc241303900 \h </w:instrText>
             </w:r>
             <w:r>
               <w:rPr>
@@ -1163,7 +1163,7 @@
               <w14:ligatures w14:val="standardContextual"/>
             </w:rPr>
           </w:pPr>
-          <w:hyperlink w:anchor="_Toc241297744" w:history="1">
+          <w:hyperlink w:anchor="_Toc241303901" w:history="1">
             <w:r>
               <w:rPr>
                 <w:rStyle w:val="Hyperlink"/>
@@ -1187,7 +1187,7 @@
               <w:rPr>
                 <w:noProof/>
               </w:rPr>
-              <w:instrText xml:space="preserve"> PAGEREF _Toc241297744 \h </w:instrText>
+              <w:instrText xml:space="preserve"> PAGEREF _Toc241303901 \h </w:instrText>
             </w:r>
             <w:r>
               <w:rPr>
@@ -1228,7 +1228,7 @@
               <w14:ligatures w14:val="standardContextual"/>
             </w:rPr>
           </w:pPr>
-          <w:hyperlink w:anchor="_Toc241297745" w:history="1">
+          <w:hyperlink w:anchor="_Toc241303902" w:history="1">
             <w:r>
               <w:rPr>
                 <w:rStyle w:val="Hyperlink"/>
@@ -1252,7 +1252,7 @@
               <w:rPr>
                 <w:noProof/>
               </w:rPr>
-              <w:instrText xml:space="preserve"> PAGEREF _Toc241297745 \h </w:instrText>
+              <w:instrText xml:space="preserve"> PAGEREF _Toc241303902 \h </w:instrText>
             </w:r>
             <w:r>
               <w:rPr>
@@ -1293,7 +1293,7 @@
               <w14:ligatures w14:val="standardContextual"/>
             </w:rPr>
           </w:pPr>
-          <w:hyperlink w:anchor="_Toc241297746" w:history="1">
+          <w:hyperlink w:anchor="_Toc241303903" w:history="1">
             <w:r>
               <w:rPr>
                 <w:rStyle w:val="Hyperlink"/>
@@ -1317,7 +1317,7 @@
               <w:rPr>
                 <w:noProof/>
               </w:rPr>
-              <w:instrText xml:space="preserve"> PAGEREF _Toc241297746 \h </w:instrText>
+              <w:instrText xml:space="preserve"> PAGEREF _Toc241303903 \h </w:instrText>
             </w:r>
             <w:r>
               <w:rPr>
@@ -1358,7 +1358,7 @@
               <w14:ligatures w14:val="standardContextual"/>
             </w:rPr>
           </w:pPr>
-          <w:hyperlink w:anchor="_Toc241297747" w:history="1">
+          <w:hyperlink w:anchor="_Toc241303904" w:history="1">
             <w:r>
               <w:rPr>
                 <w:rStyle w:val="Hyperlink"/>
@@ -1382,7 +1382,7 @@
               <w:rPr>
                 <w:noProof/>
               </w:rPr>
-              <w:instrText xml:space="preserve"> PAGEREF _Toc241297747 \h </w:instrText>
+              <w:instrText xml:space="preserve"> PAGEREF _Toc241303904 \h </w:instrText>
             </w:r>
             <w:r>
               <w:rPr>
@@ -1423,7 +1423,7 @@
               <w14:ligatures w14:val="standardContextual"/>
             </w:rPr>
           </w:pPr>
-          <w:hyperlink w:anchor="_Toc241297748" w:history="1">
+          <w:hyperlink w:anchor="_Toc241303905" w:history="1">
             <w:r>
               <w:rPr>
                 <w:rStyle w:val="Hyperlink"/>
@@ -1447,7 +1447,7 @@
               <w:rPr>
                 <w:noProof/>
               </w:rPr>
-              <w:instrText xml:space="preserve"> PAGEREF _Toc241297748 \h </w:instrText>
+              <w:instrText xml:space="preserve"> PAGEREF _Toc241303905 \h </w:instrText>
             </w:r>
             <w:r>
               <w:rPr>
@@ -1488,7 +1488,7 @@
               <w14:ligatures w14:val="standardContextual"/>
             </w:rPr>
           </w:pPr>
-          <w:hyperlink w:anchor="_Toc241297749" w:history="1">
+          <w:hyperlink w:anchor="_Toc241303906" w:history="1">
             <w:r>
               <w:rPr>
                 <w:rStyle w:val="Hyperlink"/>
@@ -1512,7 +1512,7 @@
               <w:rPr>
                 <w:noProof/>
               </w:rPr>
-              <w:instrText xml:space="preserve"> PAGEREF _Toc241297749 \h </w:instrText>
+              <w:instrText xml:space="preserve"> PAGEREF _Toc241303906 \h </w:instrText>
             </w:r>
             <w:r>
               <w:rPr>
@@ -1553,7 +1553,7 @@
               <w14:ligatures w14:val="standardContextual"/>
             </w:rPr>
           </w:pPr>
-          <w:hyperlink w:anchor="_Toc241297750" w:history="1">
+          <w:hyperlink w:anchor="_Toc241303907" w:history="1">
             <w:r>
               <w:rPr>
                 <w:rStyle w:val="Hyperlink"/>
@@ -1577,7 +1577,7 @@
               <w:rPr>
                 <w:noProof/>
               </w:rPr>
-              <w:instrText xml:space="preserve"> PAGEREF _Toc241297750 \h </w:instrText>
+              <w:instrText xml:space="preserve"> PAGEREF _Toc241303907 \h </w:instrText>
             </w:r>
             <w:r>
               <w:rPr>
@@ -1618,7 +1618,7 @@
               <w14:ligatures w14:val="standardContextual"/>
             </w:rPr>
           </w:pPr>
-          <w:hyperlink w:anchor="_Toc241297751" w:history="1">
+          <w:hyperlink w:anchor="_Toc241303908" w:history="1">
             <w:r>
               <w:rPr>
                 <w:rStyle w:val="Hyperlink"/>
@@ -1642,7 +1642,7 @@
               <w:rPr>
                 <w:noProof/>
               </w:rPr>
-              <w:instrText xml:space="preserve"> PAGEREF _Toc241297751 \h </w:instrText>
+              <w:instrText xml:space="preserve"> PAGEREF _Toc241303908 \h </w:instrText>
             </w:r>
             <w:r>
               <w:rPr>
@@ -1683,7 +1683,7 @@
               <w14:ligatures w14:val="standardContextual"/>
             </w:rPr>
           </w:pPr>
-          <w:hyperlink w:anchor="_Toc241297752" w:history="1">
+          <w:hyperlink w:anchor="_Toc241303909" w:history="1">
             <w:r>
               <w:rPr>
                 <w:rStyle w:val="Hyperlink"/>
@@ -1707,7 +1707,7 @@
               <w:rPr>
                 <w:noProof/>
               </w:rPr>
-              <w:instrText xml:space="preserve"> PAGEREF _Toc241297752 \h </w:instrText>
+              <w:instrText xml:space="preserve"> PAGEREF _Toc241303909 \h </w:instrText>
             </w:r>
             <w:r>
               <w:rPr>
@@ -1748,7 +1748,7 @@
               <w14:ligatures w14:val="standardContextual"/>
             </w:rPr>
           </w:pPr>
-          <w:hyperlink w:anchor="_Toc241297753" w:history="1">
+          <w:hyperlink w:anchor="_Toc241303910" w:history="1">
             <w:r>
               <w:rPr>
                 <w:rStyle w:val="Hyperlink"/>
@@ -1772,7 +1772,7 @@
               <w:rPr>
                 <w:noProof/>
               </w:rPr>
-              <w:instrText xml:space="preserve"> PAGEREF _Toc241297753 \h </w:instrText>
+              <w:instrText xml:space="preserve"> PAGEREF _Toc241303910 \h </w:instrText>
             </w:r>
             <w:r>
               <w:rPr>
@@ -1813,7 +1813,7 @@
               <w14:ligatures w14:val="standardContextual"/>
             </w:rPr>
           </w:pPr>
-          <w:hyperlink w:anchor="_Toc241297754" w:history="1">
+          <w:hyperlink w:anchor="_Toc241303911" w:history="1">
             <w:r>
               <w:rPr>
                 <w:rStyle w:val="Hyperlink"/>
@@ -1837,7 +1837,7 @@
               <w:rPr>
                 <w:noProof/>
               </w:rPr>
-              <w:instrText xml:space="preserve"> PAGEREF _Toc241297754 \h </w:instrText>
+              <w:instrText xml:space="preserve"> PAGEREF _Toc241303911 \h </w:instrText>
             </w:r>
             <w:r>
               <w:rPr>
@@ -1878,7 +1878,7 @@
               <w14:ligatures w14:val="standardContextual"/>
             </w:rPr>
           </w:pPr>
-          <w:hyperlink w:anchor="_Toc241297755" w:history="1">
+          <w:hyperlink w:anchor="_Toc241303912" w:history="1">
             <w:r>
               <w:rPr>
                 <w:rStyle w:val="Hyperlink"/>
@@ -1902,7 +1902,7 @@
               <w:rPr>
                 <w:noProof/>
               </w:rPr>
-              <w:instrText xml:space="preserve"> PAGEREF _Toc241297755 \h </w:instrText>
+              <w:instrText xml:space="preserve"> PAGEREF _Toc241303912 \h </w:instrText>
             </w:r>
             <w:r>
               <w:rPr>
@@ -1943,7 +1943,7 @@
               <w14:ligatures w14:val="standardContextual"/>
             </w:rPr>
           </w:pPr>
-          <w:hyperlink w:anchor="_Toc241297756" w:history="1">
+          <w:hyperlink w:anchor="_Toc241303913" w:history="1">
             <w:r>
               <w:rPr>
                 <w:rStyle w:val="Hyperlink"/>
@@ -1967,7 +1967,7 @@
               <w:rPr>
                 <w:noProof/>
               </w:rPr>
-              <w:instrText xml:space="preserve"> PAGEREF _Toc241297756 \h </w:instrText>
+              <w:instrText xml:space="preserve"> PAGEREF _Toc241303913 \h </w:instrText>
             </w:r>
             <w:r>
               <w:rPr>
@@ -2008,7 +2008,7 @@
               <w14:ligatures w14:val="standardContextual"/>
             </w:rPr>
           </w:pPr>
-          <w:hyperlink w:anchor="_Toc241297757" w:history="1">
+          <w:hyperlink w:anchor="_Toc241303914" w:history="1">
             <w:r>
               <w:rPr>
                 <w:rStyle w:val="Hyperlink"/>
@@ -2032,7 +2032,7 @@
               <w:rPr>
                 <w:noProof/>
               </w:rPr>
-              <w:instrText xml:space="preserve"> PAGEREF _Toc241297757 \h </w:instrText>
+              <w:instrText xml:space="preserve"> PAGEREF _Toc241303914 \h </w:instrText>
             </w:r>
             <w:r>
               <w:rPr>
@@ -2073,7 +2073,7 @@
               <w14:ligatures w14:val="standardContextual"/>
             </w:rPr>
           </w:pPr>
-          <w:hyperlink w:anchor="_Toc241297758" w:history="1">
+          <w:hyperlink w:anchor="_Toc241303915" w:history="1">
             <w:r>
               <w:rPr>
                 <w:rStyle w:val="Hyperlink"/>
@@ -2097,7 +2097,7 @@
               <w:rPr>
                 <w:noProof/>
               </w:rPr>
-              <w:instrText xml:space="preserve"> PAGEREF _Toc241297758 \h </w:instrText>
+              <w:instrText xml:space="preserve"> PAGEREF _Toc241303915 \h </w:instrText>
             </w:r>
             <w:r>
               <w:rPr>
@@ -2138,7 +2138,7 @@
               <w14:ligatures w14:val="standardContextual"/>
             </w:rPr>
           </w:pPr>
-          <w:hyperlink w:anchor="_Toc241297759" w:history="1">
+          <w:hyperlink w:anchor="_Toc241303916" w:history="1">
             <w:r>
               <w:rPr>
                 <w:rStyle w:val="Hyperlink"/>
@@ -2162,7 +2162,7 @@
               <w:rPr>
                 <w:noProof/>
               </w:rPr>
-              <w:instrText xml:space="preserve"> PAGEREF _Toc241297759 \h </w:instrText>
+              <w:instrText xml:space="preserve"> PAGEREF _Toc241303916 \h </w:instrText>
             </w:r>
             <w:r>
               <w:rPr>
@@ -2203,7 +2203,7 @@
               <w14:ligatures w14:val="standardContextual"/>
             </w:rPr>
           </w:pPr>
-          <w:hyperlink w:anchor="_Toc241297760" w:history="1">
+          <w:hyperlink w:anchor="_Toc241303917" w:history="1">
             <w:r>
               <w:rPr>
                 <w:rStyle w:val="Hyperlink"/>
@@ -2227,7 +2227,7 @@
               <w:rPr>
                 <w:noProof/>
               </w:rPr>
-              <w:instrText xml:space="preserve"> PAGEREF _Toc241297760 \h </w:instrText>
+              <w:instrText xml:space="preserve"> PAGEREF _Toc241303917 \h </w:instrText>
             </w:r>
             <w:r>
               <w:rPr>
@@ -2268,7 +2268,7 @@
               <w14:ligatures w14:val="standardContextual"/>
             </w:rPr>
           </w:pPr>
-          <w:hyperlink w:anchor="_Toc241297761" w:history="1">
+          <w:hyperlink w:anchor="_Toc241303918" w:history="1">
             <w:r>
               <w:rPr>
                 <w:rStyle w:val="Hyperlink"/>
@@ -2292,7 +2292,7 @@
               <w:rPr>
                 <w:noProof/>
               </w:rPr>
-              <w:instrText xml:space="preserve"> PAGEREF _Toc241297761 \h </w:instrText>
+              <w:instrText xml:space="preserve"> PAGEREF _Toc241303918 \h </w:instrText>
             </w:r>
             <w:r>
               <w:rPr>
@@ -2333,7 +2333,7 @@
               <w14:ligatures w14:val="standardContextual"/>
             </w:rPr>
           </w:pPr>
-          <w:hyperlink w:anchor="_Toc241297762" w:history="1">
+          <w:hyperlink w:anchor="_Toc241303919" w:history="1">
             <w:r>
               <w:rPr>
                 <w:rStyle w:val="Hyperlink"/>
@@ -2357,7 +2357,7 @@
               <w:rPr>
                 <w:noProof/>
               </w:rPr>
-              <w:instrText xml:space="preserve"> PAGEREF _Toc241297762 \h </w:instrText>
+              <w:instrText xml:space="preserve"> PAGEREF _Toc241303919 \h </w:instrText>
             </w:r>
             <w:r>
               <w:rPr>
@@ -2398,7 +2398,7 @@
               <w14:ligatures w14:val="standardContextual"/>
             </w:rPr>
           </w:pPr>
-          <w:hyperlink w:anchor="_Toc241297763" w:history="1">
+          <w:hyperlink w:anchor="_Toc241303920" w:history="1">
             <w:r>
               <w:rPr>
                 <w:rStyle w:val="Hyperlink"/>
@@ -2422,7 +2422,7 @@
               <w:rPr>
                 <w:noProof/>
               </w:rPr>
-              <w:instrText xml:space="preserve"> PAGEREF _Toc241297763 \h </w:instrText>
+              <w:instrText xml:space="preserve"> PAGEREF _Toc241303920 \h </w:instrText>
             </w:r>
             <w:r>
               <w:rPr>
@@ -2463,7 +2463,7 @@
               <w14:ligatures w14:val="standardContextual"/>
             </w:rPr>
           </w:pPr>
-          <w:hyperlink w:anchor="_Toc241297764" w:history="1">
+          <w:hyperlink w:anchor="_Toc241303921" w:history="1">
             <w:r>
               <w:rPr>
                 <w:rStyle w:val="Hyperlink"/>
@@ -2487,7 +2487,7 @@
               <w:rPr>
                 <w:noProof/>
               </w:rPr>
-              <w:instrText xml:space="preserve"> PAGEREF _Toc241297764 \h </w:instrText>
+              <w:instrText xml:space="preserve"> PAGEREF _Toc241303921 \h </w:instrText>
             </w:r>
             <w:r>
               <w:rPr>
@@ -2539,7 +2539,7 @@
         <w:pStyle w:val="Heading1"/>
         <w:pageBreakBefore/>
       </w:pPr>
-      <w:bookmarkStart w:id="2" w:name="_Toc241297731"/>
+      <w:bookmarkStart w:id="2" w:name="_Toc241303888"/>
       <w:r>
         <w:lastRenderedPageBreak/>
         <w:t>1. Introduction</w:t>
@@ -2550,7 +2550,7 @@
       <w:pPr>
         <w:pStyle w:val="Heading2"/>
       </w:pPr>
-      <w:bookmarkStart w:id="3" w:name="_Toc241297732"/>
+      <w:bookmarkStart w:id="3" w:name="_Toc241303889"/>
       <w:r>
         <w:t>1.1 Problem</w:t>
       </w:r>
@@ -2629,7 +2629,7 @@
       <w:pPr>
         <w:pStyle w:val="Heading2"/>
       </w:pPr>
-      <w:bookmarkStart w:id="4" w:name="_Toc241297733"/>
+      <w:bookmarkStart w:id="4" w:name="_Toc241303890"/>
       <w:r>
         <w:t>1.2 Objectives</w:t>
       </w:r>
@@ -2717,7 +2717,7 @@
       <w:pPr>
         <w:pStyle w:val="Heading2"/>
       </w:pPr>
-      <w:bookmarkStart w:id="5" w:name="_Toc241297734"/>
+      <w:bookmarkStart w:id="5" w:name="_Toc241303891"/>
       <w:r>
         <w:t>1.3 Contributions</w:t>
       </w:r>
@@ -3084,7 +3084,7 @@
         <w:pStyle w:val="Heading1"/>
         <w:pageBreakBefore/>
       </w:pPr>
-      <w:bookmarkStart w:id="6" w:name="_Toc241297735"/>
+      <w:bookmarkStart w:id="6" w:name="_Toc241303892"/>
       <w:r>
         <w:lastRenderedPageBreak/>
         <w:t>2. Literature Review</w:t>
@@ -3095,7 +3095,7 @@
       <w:pPr>
         <w:pStyle w:val="Heading2"/>
       </w:pPr>
-      <w:bookmarkStart w:id="7" w:name="_Toc241297736"/>
+      <w:bookmarkStart w:id="7" w:name="_Toc241303893"/>
       <w:r>
         <w:t>2.1 SMS spam filtering</w:t>
       </w:r>
@@ -3117,7 +3117,7 @@
       <w:pPr>
         <w:pStyle w:val="Heading2"/>
       </w:pPr>
-      <w:bookmarkStart w:id="8" w:name="_Toc241297737"/>
+      <w:bookmarkStart w:id="8" w:name="_Toc241303894"/>
       <w:r>
         <w:t>2.2 Smishing</w:t>
       </w:r>
@@ -3136,7 +3136,7 @@
       <w:pPr>
         <w:pStyle w:val="Heading2"/>
       </w:pPr>
-      <w:bookmarkStart w:id="9" w:name="_Toc241297738"/>
+      <w:bookmarkStart w:id="9" w:name="_Toc241303895"/>
       <w:r>
         <w:t>2.3 Neural text classifiers</w:t>
       </w:r>
@@ -3155,7 +3155,7 @@
       <w:pPr>
         <w:pStyle w:val="Heading2"/>
       </w:pPr>
-      <w:bookmarkStart w:id="10" w:name="_Toc241297739"/>
+      <w:bookmarkStart w:id="10" w:name="_Toc241303896"/>
       <w:r>
         <w:t>2.4 Adversarial text and robustness</w:t>
       </w:r>
@@ -3174,7 +3174,7 @@
       <w:pPr>
         <w:pStyle w:val="Heading2"/>
       </w:pPr>
-      <w:bookmarkStart w:id="11" w:name="_Toc241297740"/>
+      <w:bookmarkStart w:id="11" w:name="_Toc241303897"/>
       <w:r>
         <w:t>2.5 Explainability and calibration</w:t>
       </w:r>
@@ -3194,7 +3194,7 @@
         <w:pStyle w:val="Heading1"/>
         <w:pageBreakBefore/>
       </w:pPr>
-      <w:bookmarkStart w:id="12" w:name="_Toc241297741"/>
+      <w:bookmarkStart w:id="12" w:name="_Toc241303898"/>
       <w:r>
         <w:lastRenderedPageBreak/>
         <w:t>3. Datasets</w:t>
@@ -3205,7 +3205,7 @@
       <w:pPr>
         <w:pStyle w:val="Heading2"/>
       </w:pPr>
-      <w:bookmarkStart w:id="13" w:name="_Toc241297742"/>
+      <w:bookmarkStart w:id="13" w:name="_Toc241303899"/>
       <w:r>
         <w:t>3.1 Sources</w:t>
       </w:r>
@@ -3940,7 +3940,7 @@
       <w:pPr>
         <w:pStyle w:val="Heading2"/>
       </w:pPr>
-      <w:bookmarkStart w:id="14" w:name="_Toc241297743"/>
+      <w:bookmarkStart w:id="14" w:name="_Toc241303900"/>
       <w:r>
         <w:t>3.2 The Indian set</w:t>
       </w:r>
@@ -3952,7 +3952,7 @@
         <w:jc w:val="both"/>
       </w:pPr>
       <w:r>
-        <w:t>Our own collection of personal messages was too small, so the Indian set was assembled from public data. The Indian Telecom SMS Spam Collection contributes genuine Indian telecom, bank and investment-scam messages; the ScamShield dataset contributes real rows only (rows the authors mark as LLM-generated were excluded and verified absent), filtered to English or Hinglish messages that reference Indian brands, currency or services. A machine-generated Hugging Face collection was inspected and rejected.</w:t>
+        <w:t>My own collection of personal messages was too small, so the Indian set was assembled from public data. The Indian Telecom SMS Spam Collection contributes genuine Indian telecom, bank and investment-scam messages; the ScamShield dataset contributes real rows only (rows the authors mark as LLM-generated were excluded and verified absent), filtered to English or Hinglish messages that reference Indian brands, currency or services. A machine-generated Hugging Face collection was inspected and rejected.</w:t>
       </w:r>
     </w:p>
     <w:p>
@@ -4973,7 +4973,7 @@
       <w:pPr>
         <w:pStyle w:val="Heading2"/>
       </w:pPr>
-      <w:bookmarkStart w:id="15" w:name="_Toc241297744"/>
+      <w:bookmarkStart w:id="15" w:name="_Toc241303901"/>
       <w:r>
         <w:t>3.3 Ethics and anonymisation</w:t>
       </w:r>
@@ -4992,7 +4992,7 @@
       <w:pPr>
         <w:pStyle w:val="Heading2"/>
       </w:pPr>
-      <w:bookmarkStart w:id="16" w:name="_Toc241297745"/>
+      <w:bookmarkStart w:id="16" w:name="_Toc241303902"/>
       <w:r>
         <w:t>3.4 Obfuscated test copies</w:t>
       </w:r>
@@ -5012,7 +5012,7 @@
         <w:pStyle w:val="Heading1"/>
         <w:pageBreakBefore/>
       </w:pPr>
-      <w:bookmarkStart w:id="17" w:name="_Toc241297746"/>
+      <w:bookmarkStart w:id="17" w:name="_Toc241303903"/>
       <w:r>
         <w:lastRenderedPageBreak/>
         <w:t>4. Methodology</w:t>
@@ -5032,7 +5032,7 @@
       <w:pPr>
         <w:pStyle w:val="Heading2"/>
       </w:pPr>
-      <w:bookmarkStart w:id="18" w:name="_Toc241297747"/>
+      <w:bookmarkStart w:id="18" w:name="_Toc241303904"/>
       <w:r>
         <w:t>4.1 Normalizer</w:t>
       </w:r>
@@ -5051,7 +5051,7 @@
       <w:pPr>
         <w:pStyle w:val="Heading2"/>
       </w:pPr>
-      <w:bookmarkStart w:id="19" w:name="_Toc241297748"/>
+      <w:bookmarkStart w:id="19" w:name="_Toc241303905"/>
       <w:r>
         <w:t>4.2 Features</w:t>
       </w:r>
@@ -5070,7 +5070,7 @@
       <w:pPr>
         <w:pStyle w:val="Heading2"/>
       </w:pPr>
-      <w:bookmarkStart w:id="20" w:name="_Toc241297749"/>
+      <w:bookmarkStart w:id="20" w:name="_Toc241303906"/>
       <w:r>
         <w:t>4.3 Models</w:t>
       </w:r>
@@ -5169,7 +5169,7 @@
       <w:pPr>
         <w:pStyle w:val="Heading2"/>
       </w:pPr>
-      <w:bookmarkStart w:id="21" w:name="_Toc241297750"/>
+      <w:bookmarkStart w:id="21" w:name="_Toc241303907"/>
       <w:r>
         <w:t>4.4 Risk score, confidence and uncertainty</w:t>
       </w:r>
@@ -5192,7 +5192,7 @@
       <w:pPr>
         <w:pStyle w:val="Heading2"/>
       </w:pPr>
-      <w:bookmarkStart w:id="22" w:name="_Toc241297751"/>
+      <w:bookmarkStart w:id="22" w:name="_Toc241303908"/>
       <w:r>
         <w:t>4.5 Explanations</w:t>
       </w:r>
@@ -5211,7 +5211,7 @@
       <w:pPr>
         <w:pStyle w:val="Heading2"/>
       </w:pPr>
-      <w:bookmarkStart w:id="23" w:name="_Toc241297752"/>
+      <w:bookmarkStart w:id="23" w:name="_Toc241303909"/>
       <w:r>
         <w:t>4.6 URL forensics</w:t>
       </w:r>
@@ -5231,7 +5231,7 @@
         <w:pStyle w:val="Heading1"/>
         <w:pageBreakBefore/>
       </w:pPr>
-      <w:bookmarkStart w:id="24" w:name="_Toc241297753"/>
+      <w:bookmarkStart w:id="24" w:name="_Toc241303910"/>
       <w:r>
         <w:lastRenderedPageBreak/>
         <w:t>5. Implementation</w:t>
@@ -5831,7 +5831,7 @@
         <w:pStyle w:val="Heading1"/>
         <w:pageBreakBefore/>
       </w:pPr>
-      <w:bookmarkStart w:id="25" w:name="_Toc241297754"/>
+      <w:bookmarkStart w:id="25" w:name="_Toc241303911"/>
       <w:r>
         <w:lastRenderedPageBreak/>
         <w:t>6. Results</w:t>
@@ -5851,7 +5851,7 @@
       <w:pPr>
         <w:pStyle w:val="Heading2"/>
       </w:pPr>
-      <w:bookmarkStart w:id="26" w:name="_Toc241297755"/>
+      <w:bookmarkStart w:id="26" w:name="_Toc241303912"/>
       <w:r>
         <w:t>6.1 E1: baseline on UCI</w:t>
       </w:r>
@@ -7866,7 +7866,7 @@
       <w:pPr>
         <w:pStyle w:val="Heading2"/>
       </w:pPr>
-      <w:bookmarkStart w:id="27" w:name="_Toc241297756"/>
+      <w:bookmarkStart w:id="27" w:name="_Toc241303913"/>
       <w:r>
         <w:t>6.2 E2: domain shift</w:t>
       </w:r>
@@ -9060,7 +9060,7 @@
         </w:rPr>
         <w:lastRenderedPageBreak/>
         <w:drawing>
-          <wp:inline distT="0" distB="0" distL="0" distR="0" wp14:anchorId="2248F69A" wp14:editId="642925DE">
+          <wp:inline distT="0" distB="0" distL="0" distR="0" wp14:anchorId="12E000DA" wp14:editId="368D5EC0">
             <wp:extent cx="5334000" cy="3714750"/>
             <wp:effectExtent l="0" t="0" r="0" b="0"/>
             <wp:docPr id="1" name="Picture 1"/>
@@ -9137,7 +9137,7 @@
       <w:pPr>
         <w:pStyle w:val="Heading2"/>
       </w:pPr>
-      <w:bookmarkStart w:id="28" w:name="_Toc241297757"/>
+      <w:bookmarkStart w:id="28" w:name="_Toc241303914"/>
       <w:r>
         <w:t>6.3 E3: recovery with Indian data</w:t>
       </w:r>
@@ -11848,10 +11848,10 @@
           <w:noProof/>
         </w:rPr>
         <w:drawing>
-          <wp:inline distT="0" distB="0" distL="0" distR="0" wp14:anchorId="199EB122" wp14:editId="77FE2603">
+          <wp:inline distT="0" distB="0" distL="0" distR="0" wp14:anchorId="6878A987" wp14:editId="780C83FF">
             <wp:extent cx="3619500" cy="3143250"/>
             <wp:effectExtent l="0" t="0" r="0" b="0"/>
-            <wp:docPr id="785187938" name="Picture 785187938"/>
+            <wp:docPr id="1054096209" name="Picture 1054096209"/>
             <wp:cNvGraphicFramePr>
               <a:graphicFrameLocks xmlns:a="http://schemas.openxmlformats.org/drawingml/2006/main" noChangeAspect="1"/>
             </wp:cNvGraphicFramePr>
@@ -11916,7 +11916,7 @@
       <w:pPr>
         <w:pStyle w:val="Heading2"/>
       </w:pPr>
-      <w:bookmarkStart w:id="29" w:name="_Toc241297758"/>
+      <w:bookmarkStart w:id="29" w:name="_Toc241303915"/>
       <w:r>
         <w:t>6.4 E4 and E7: robustness to obfuscation</w:t>
       </w:r>
@@ -13226,10 +13226,10 @@
           <w:noProof/>
         </w:rPr>
         <w:drawing>
-          <wp:inline distT="0" distB="0" distL="0" distR="0" wp14:anchorId="6C0537EC" wp14:editId="1F3F5C3C">
+          <wp:inline distT="0" distB="0" distL="0" distR="0" wp14:anchorId="1330B351" wp14:editId="4E5BF0A2">
             <wp:extent cx="5334000" cy="2247900"/>
             <wp:effectExtent l="0" t="0" r="0" b="0"/>
-            <wp:docPr id="709449773" name="Picture 709449773"/>
+            <wp:docPr id="1336016275" name="Picture 1336016275"/>
             <wp:cNvGraphicFramePr>
               <a:graphicFrameLocks xmlns:a="http://schemas.openxmlformats.org/drawingml/2006/main" noChangeAspect="1"/>
             </wp:cNvGraphicFramePr>
@@ -16060,7 +16060,7 @@
       <w:pPr>
         <w:pStyle w:val="Heading2"/>
       </w:pPr>
-      <w:bookmarkStart w:id="30" w:name="_Toc241297759"/>
+      <w:bookmarkStart w:id="30" w:name="_Toc241303916"/>
       <w:r>
         <w:t>6.5 E5: scam category</w:t>
       </w:r>
@@ -16427,7 +16427,7 @@
       <w:pPr>
         <w:pStyle w:val="Heading2"/>
       </w:pPr>
-      <w:bookmarkStart w:id="31" w:name="_Toc241297760"/>
+      <w:bookmarkStart w:id="31" w:name="_Toc241303917"/>
       <w:r>
         <w:t>6.6 E6: calibration</w:t>
       </w:r>
@@ -16877,10 +16877,10 @@
           <w:noProof/>
         </w:rPr>
         <w:drawing>
-          <wp:inline distT="0" distB="0" distL="0" distR="0" wp14:anchorId="5CC23B3E" wp14:editId="2267A460">
+          <wp:inline distT="0" distB="0" distL="0" distR="0" wp14:anchorId="382B5842" wp14:editId="71E5BAE8">
             <wp:extent cx="5334000" cy="1781175"/>
             <wp:effectExtent l="0" t="0" r="0" b="0"/>
-            <wp:docPr id="460175813" name="Picture 460175813"/>
+            <wp:docPr id="526349577" name="Picture 526349577"/>
             <wp:cNvGraphicFramePr>
               <a:graphicFrameLocks xmlns:a="http://schemas.openxmlformats.org/drawingml/2006/main" noChangeAspect="1"/>
             </wp:cNvGraphicFramePr>
@@ -16955,7 +16955,7 @@
         <w:pStyle w:val="Heading1"/>
         <w:pageBreakBefore/>
       </w:pPr>
-      <w:bookmarkStart w:id="32" w:name="_Toc241297761"/>
+      <w:bookmarkStart w:id="32" w:name="_Toc241303918"/>
       <w:r>
         <w:lastRenderedPageBreak/>
         <w:t>7. Conclusion</w:t>
@@ -16975,7 +16975,7 @@
       <w:pPr>
         <w:pStyle w:val="Heading2"/>
       </w:pPr>
-      <w:bookmarkStart w:id="33" w:name="_Toc241297762"/>
+      <w:bookmarkStart w:id="33" w:name="_Toc241303919"/>
       <w:r>
         <w:t>7.1 Limitations</w:t>
       </w:r>
@@ -17063,7 +17063,7 @@
       <w:pPr>
         <w:pStyle w:val="Heading2"/>
       </w:pPr>
-      <w:bookmarkStart w:id="34" w:name="_Toc241297763"/>
+      <w:bookmarkStart w:id="34" w:name="_Toc241303920"/>
       <w:r>
         <w:t>7.2 Future work</w:t>
       </w:r>
@@ -17126,7 +17126,7 @@
         <w:pStyle w:val="Heading1"/>
         <w:pageBreakBefore/>
       </w:pPr>
-      <w:bookmarkStart w:id="35" w:name="_Toc241297764"/>
+      <w:bookmarkStart w:id="35" w:name="_Toc241303921"/>
       <w:r>
         <w:lastRenderedPageBreak/>
         <w:t>References</w:t>
@@ -17471,64 +17471,10 @@
 <file path=word/numbering.xml><?xml version="1.0" encoding="utf-8"?>
 <w:numbering xmlns:wpc="http://schemas.microsoft.com/office/word/2010/wordprocessingCanvas" xmlns:cx="http://schemas.microsoft.com/office/drawing/2014/chartex" xmlns:cx1="http://schemas.microsoft.com/office/drawing/2015/9/8/chartex" xmlns:cx2="http://schemas.microsoft.com/office/drawing/2015/10/21/chartex" xmlns:cx3="http://schemas.microsoft.com/office/drawing/2016/5/9/chartex" xmlns:cx4="http://schemas.microsoft.com/office/drawing/2016/5/10/chartex" xmlns:cx5="http://schemas.microsoft.com/office/drawing/2016/5/11/chartex" xmlns:cx6="http://schemas.microsoft.com/office/drawing/2016/5/12/chartex" xmlns:cx7="http://schemas.microsoft.com/office/drawing/2016/5/13/chartex" xmlns:cx8="http://schemas.microsoft.com/office/drawing/2016/5/14/chartex" xmlns:mc="http://schemas.openxmlformats.org/markup-compatibility/2006" xmlns:aink="http://schemas.microsoft.com/office/drawing/2016/ink" xmlns:am3d="http://schemas.microsoft.com/office/drawing/2017/model3d" xmlns:o="urn:schemas-microsoft-com:office:office" xmlns:oel="http://schemas.microsoft.com/office/2019/extlst" xmlns:r="http://schemas.openxmlformats.org/officeDocument/2006/relationships" xmlns:m="http://schemas.openxmlformats.org/officeDocument/2006/math" xmlns:v="urn:schemas-microsoft-com:vml" xmlns:wp14="http://schemas.microsoft.com/office/word/2010/wordprocessingDrawing" xmlns:wp="http://schemas.openxmlformats.org/drawingml/2006/wordprocessingDrawing" xmlns:w10="urn:schemas-microsoft-com:office:word" xmlns:w="http://schemas.openxmlformats.org/wordprocessingml/2006/main" xmlns:w14="http://schemas.microsoft.com/office/word/2010/wordml" xmlns:w15="http://schemas.microsoft.com/office/word/2012/wordml" xmlns:w16cex="http://schemas.microsoft.com/office/word/2018/wordml/cex" xmlns:w16cid="http://schemas.microsoft.com/office/word/2016/wordml/cid" xmlns:w16="http://schemas.microsoft.com/office/word/2018/wordml" xmlns:w16du="http://schemas.microsoft.com/office/word/2023/wordml/word16du" xmlns:w16sdtdh="http://schemas.microsoft.com/office/word/2020/wordml/sdtdatahash" xmlns:w16sdtfl="http://schemas.microsoft.com/office/word/2024/wordml/sdtformatlock" xmlns:w16se="http://schemas.microsoft.com/office/word/2015/wordml/symex" xmlns:wpg="http://schemas.microsoft.com/office/word/2010/wordprocessingGroup" xmlns:wpi="http://schemas.microsoft.com/office/word/2010/wordprocessingInk" xmlns:wne="http://schemas.microsoft.com/office/word/2006/wordml" xmlns:wps="http://schemas.microsoft.com/office/word/2010/wordprocessingShape" mc:Ignorable="w14 w15 w16se w16cid w16 w16cex w16sdtdh w16sdtfl w16du wp14">
   <w:abstractNum w:abstractNumId="0" w15:restartNumberingAfterBreak="0">
-    <w:nsid w:val="14AB1B58"/>
+    <w:nsid w:val="1CD1227F"/>
     <w:multiLevelType w:val="hybridMultilevel"/>
-    <w:tmpl w:val="5EDC7C04"/>
-    <w:lvl w:ilvl="0" w:tplc="21340B80">
-      <w:start w:val="1"/>
-      <w:numFmt w:val="decimal"/>
-      <w:lvlText w:val="%1."/>
-      <w:lvlJc w:val="left"/>
-      <w:pPr>
-        <w:ind w:left="600" w:hanging="420"/>
-      </w:pPr>
-    </w:lvl>
-    <w:lvl w:ilvl="1" w:tplc="71D80508">
-      <w:numFmt w:val="decimal"/>
-      <w:lvlText w:val=""/>
-      <w:lvlJc w:val="left"/>
-    </w:lvl>
-    <w:lvl w:ilvl="2" w:tplc="74623BD2">
-      <w:numFmt w:val="decimal"/>
-      <w:lvlText w:val=""/>
-      <w:lvlJc w:val="left"/>
-    </w:lvl>
-    <w:lvl w:ilvl="3" w:tplc="41B6360A">
-      <w:numFmt w:val="decimal"/>
-      <w:lvlText w:val=""/>
-      <w:lvlJc w:val="left"/>
-    </w:lvl>
-    <w:lvl w:ilvl="4" w:tplc="920C3D82">
-      <w:numFmt w:val="decimal"/>
-      <w:lvlText w:val=""/>
-      <w:lvlJc w:val="left"/>
-    </w:lvl>
-    <w:lvl w:ilvl="5" w:tplc="11A0A5BE">
-      <w:numFmt w:val="decimal"/>
-      <w:lvlText w:val=""/>
-      <w:lvlJc w:val="left"/>
-    </w:lvl>
-    <w:lvl w:ilvl="6" w:tplc="E424E3B8">
-      <w:numFmt w:val="decimal"/>
-      <w:lvlText w:val=""/>
-      <w:lvlJc w:val="left"/>
-    </w:lvl>
-    <w:lvl w:ilvl="7" w:tplc="C45A2704">
-      <w:numFmt w:val="decimal"/>
-      <w:lvlText w:val=""/>
-      <w:lvlJc w:val="left"/>
-    </w:lvl>
-    <w:lvl w:ilvl="8" w:tplc="47421B3A">
-      <w:numFmt w:val="decimal"/>
-      <w:lvlText w:val=""/>
-      <w:lvlJc w:val="left"/>
-    </w:lvl>
-  </w:abstractNum>
-  <w:abstractNum w:abstractNumId="1" w15:restartNumberingAfterBreak="0">
-    <w:nsid w:val="1596509F"/>
-    <w:multiLevelType w:val="hybridMultilevel"/>
-    <w:tmpl w:val="29889716"/>
-    <w:lvl w:ilvl="0" w:tplc="D1706182">
+    <w:tmpl w:val="83E6818A"/>
+    <w:lvl w:ilvl="0" w:tplc="FB02256A">
       <w:start w:val="1"/>
       <w:numFmt w:val="bullet"/>
       <w:lvlText w:val="●"/>
@@ -17537,7 +17483,7 @@
         <w:ind w:left="720" w:hanging="360"/>
       </w:pPr>
     </w:lvl>
-    <w:lvl w:ilvl="1" w:tplc="36A00CAE">
+    <w:lvl w:ilvl="1" w:tplc="9EE2ACC4">
       <w:start w:val="1"/>
       <w:numFmt w:val="bullet"/>
       <w:lvlText w:val="○"/>
@@ -17546,7 +17492,7 @@
         <w:ind w:left="1440" w:hanging="360"/>
       </w:pPr>
     </w:lvl>
-    <w:lvl w:ilvl="2" w:tplc="ACC694C2">
+    <w:lvl w:ilvl="2" w:tplc="64EE91C4">
       <w:start w:val="1"/>
       <w:numFmt w:val="bullet"/>
       <w:lvlText w:val="■"/>
@@ -17555,7 +17501,7 @@
         <w:ind w:left="2160" w:hanging="360"/>
       </w:pPr>
     </w:lvl>
-    <w:lvl w:ilvl="3" w:tplc="5D9A51CC">
+    <w:lvl w:ilvl="3" w:tplc="78F2690C">
       <w:start w:val="1"/>
       <w:numFmt w:val="bullet"/>
       <w:lvlText w:val="●"/>
@@ -17564,7 +17510,7 @@
         <w:ind w:left="2880" w:hanging="360"/>
       </w:pPr>
     </w:lvl>
-    <w:lvl w:ilvl="4" w:tplc="675EEA46">
+    <w:lvl w:ilvl="4" w:tplc="778813A0">
       <w:start w:val="1"/>
       <w:numFmt w:val="bullet"/>
       <w:lvlText w:val="○"/>
@@ -17573,7 +17519,7 @@
         <w:ind w:left="3600" w:hanging="360"/>
       </w:pPr>
     </w:lvl>
-    <w:lvl w:ilvl="5" w:tplc="08028A0E">
+    <w:lvl w:ilvl="5" w:tplc="246CA13A">
       <w:start w:val="1"/>
       <w:numFmt w:val="bullet"/>
       <w:lvlText w:val="■"/>
@@ -17582,7 +17528,7 @@
         <w:ind w:left="4320" w:hanging="360"/>
       </w:pPr>
     </w:lvl>
-    <w:lvl w:ilvl="6" w:tplc="B0B6C2F2">
+    <w:lvl w:ilvl="6" w:tplc="B19AE8A8">
       <w:start w:val="1"/>
       <w:numFmt w:val="bullet"/>
       <w:lvlText w:val="●"/>
@@ -17591,7 +17537,7 @@
         <w:ind w:left="5040" w:hanging="360"/>
       </w:pPr>
     </w:lvl>
-    <w:lvl w:ilvl="7" w:tplc="3E584594">
+    <w:lvl w:ilvl="7" w:tplc="2C949F72">
       <w:start w:val="1"/>
       <w:numFmt w:val="bullet"/>
       <w:lvlText w:val="●"/>
@@ -17600,7 +17546,7 @@
         <w:ind w:left="5760" w:hanging="360"/>
       </w:pPr>
     </w:lvl>
-    <w:lvl w:ilvl="8" w:tplc="A344F178">
+    <w:lvl w:ilvl="8" w:tplc="680046FA">
       <w:start w:val="1"/>
       <w:numFmt w:val="bullet"/>
       <w:lvlText w:val="●"/>
@@ -17610,11 +17556,119 @@
       </w:pPr>
     </w:lvl>
   </w:abstractNum>
+  <w:abstractNum w:abstractNumId="1" w15:restartNumberingAfterBreak="0">
+    <w:nsid w:val="33F73B9B"/>
+    <w:multiLevelType w:val="hybridMultilevel"/>
+    <w:tmpl w:val="CFC67EC8"/>
+    <w:lvl w:ilvl="0" w:tplc="62921666">
+      <w:start w:val="1"/>
+      <w:numFmt w:val="decimal"/>
+      <w:lvlText w:val="%1."/>
+      <w:lvlJc w:val="left"/>
+      <w:pPr>
+        <w:ind w:left="600" w:hanging="420"/>
+      </w:pPr>
+    </w:lvl>
+    <w:lvl w:ilvl="1" w:tplc="ACB4F1E8">
+      <w:numFmt w:val="decimal"/>
+      <w:lvlText w:val=""/>
+      <w:lvlJc w:val="left"/>
+    </w:lvl>
+    <w:lvl w:ilvl="2" w:tplc="E6FC12FE">
+      <w:numFmt w:val="decimal"/>
+      <w:lvlText w:val=""/>
+      <w:lvlJc w:val="left"/>
+    </w:lvl>
+    <w:lvl w:ilvl="3" w:tplc="11789BC8">
+      <w:numFmt w:val="decimal"/>
+      <w:lvlText w:val=""/>
+      <w:lvlJc w:val="left"/>
+    </w:lvl>
+    <w:lvl w:ilvl="4" w:tplc="DD50F19A">
+      <w:numFmt w:val="decimal"/>
+      <w:lvlText w:val=""/>
+      <w:lvlJc w:val="left"/>
+    </w:lvl>
+    <w:lvl w:ilvl="5" w:tplc="294E164C">
+      <w:numFmt w:val="decimal"/>
+      <w:lvlText w:val=""/>
+      <w:lvlJc w:val="left"/>
+    </w:lvl>
+    <w:lvl w:ilvl="6" w:tplc="B844A9B0">
+      <w:numFmt w:val="decimal"/>
+      <w:lvlText w:val=""/>
+      <w:lvlJc w:val="left"/>
+    </w:lvl>
+    <w:lvl w:ilvl="7" w:tplc="769E20B2">
+      <w:numFmt w:val="decimal"/>
+      <w:lvlText w:val=""/>
+      <w:lvlJc w:val="left"/>
+    </w:lvl>
+    <w:lvl w:ilvl="8" w:tplc="D3805BAC">
+      <w:numFmt w:val="decimal"/>
+      <w:lvlText w:val=""/>
+      <w:lvlJc w:val="left"/>
+    </w:lvl>
+  </w:abstractNum>
   <w:abstractNum w:abstractNumId="2" w15:restartNumberingAfterBreak="0">
-    <w:nsid w:val="2BBE53DD"/>
+    <w:nsid w:val="4CD37517"/>
     <w:multiLevelType w:val="hybridMultilevel"/>
-    <w:tmpl w:val="2634FB08"/>
-    <w:lvl w:ilvl="0" w:tplc="082A9B8C">
+    <w:tmpl w:val="98E05B80"/>
+    <w:lvl w:ilvl="0" w:tplc="C8E8246A">
+      <w:start w:val="1"/>
+      <w:numFmt w:val="decimal"/>
+      <w:lvlText w:val="[%1]"/>
+      <w:lvlJc w:val="left"/>
+      <w:pPr>
+        <w:ind w:left="600" w:hanging="420"/>
+      </w:pPr>
+    </w:lvl>
+    <w:lvl w:ilvl="1" w:tplc="5FFE2892">
+      <w:numFmt w:val="decimal"/>
+      <w:lvlText w:val=""/>
+      <w:lvlJc w:val="left"/>
+    </w:lvl>
+    <w:lvl w:ilvl="2" w:tplc="C396FDBA">
+      <w:numFmt w:val="decimal"/>
+      <w:lvlText w:val=""/>
+      <w:lvlJc w:val="left"/>
+    </w:lvl>
+    <w:lvl w:ilvl="3" w:tplc="89B0CB12">
+      <w:numFmt w:val="decimal"/>
+      <w:lvlText w:val=""/>
+      <w:lvlJc w:val="left"/>
+    </w:lvl>
+    <w:lvl w:ilvl="4" w:tplc="FC8E775E">
+      <w:numFmt w:val="decimal"/>
+      <w:lvlText w:val=""/>
+      <w:lvlJc w:val="left"/>
+    </w:lvl>
+    <w:lvl w:ilvl="5" w:tplc="F4C0F830">
+      <w:numFmt w:val="decimal"/>
+      <w:lvlText w:val=""/>
+      <w:lvlJc w:val="left"/>
+    </w:lvl>
+    <w:lvl w:ilvl="6" w:tplc="0B9016D0">
+      <w:numFmt w:val="decimal"/>
+      <w:lvlText w:val=""/>
+      <w:lvlJc w:val="left"/>
+    </w:lvl>
+    <w:lvl w:ilvl="7" w:tplc="7B20DBA4">
+      <w:numFmt w:val="decimal"/>
+      <w:lvlText w:val=""/>
+      <w:lvlJc w:val="left"/>
+    </w:lvl>
+    <w:lvl w:ilvl="8" w:tplc="C3FE6E6C">
+      <w:numFmt w:val="decimal"/>
+      <w:lvlText w:val=""/>
+      <w:lvlJc w:val="left"/>
+    </w:lvl>
+  </w:abstractNum>
+  <w:abstractNum w:abstractNumId="3" w15:restartNumberingAfterBreak="0">
+    <w:nsid w:val="52DC1A01"/>
+    <w:multiLevelType w:val="hybridMultilevel"/>
+    <w:tmpl w:val="833AB97A"/>
+    <w:lvl w:ilvl="0" w:tplc="32D435B6">
       <w:start w:val="1"/>
       <w:numFmt w:val="bullet"/>
       <w:lvlText w:val="•"/>
@@ -17623,106 +17677,52 @@
         <w:ind w:left="540" w:hanging="270"/>
       </w:pPr>
     </w:lvl>
-    <w:lvl w:ilvl="1" w:tplc="B73E4E1E">
+    <w:lvl w:ilvl="1" w:tplc="FD1CBD8E">
       <w:numFmt w:val="decimal"/>
       <w:lvlText w:val=""/>
       <w:lvlJc w:val="left"/>
     </w:lvl>
-    <w:lvl w:ilvl="2" w:tplc="43B610CA">
+    <w:lvl w:ilvl="2" w:tplc="68D64F84">
       <w:numFmt w:val="decimal"/>
       <w:lvlText w:val=""/>
       <w:lvlJc w:val="left"/>
     </w:lvl>
-    <w:lvl w:ilvl="3" w:tplc="535EB5B6">
+    <w:lvl w:ilvl="3" w:tplc="E5129C80">
       <w:numFmt w:val="decimal"/>
       <w:lvlText w:val=""/>
       <w:lvlJc w:val="left"/>
     </w:lvl>
-    <w:lvl w:ilvl="4" w:tplc="9A4E368A">
+    <w:lvl w:ilvl="4" w:tplc="6FE6476E">
       <w:numFmt w:val="decimal"/>
       <w:lvlText w:val=""/>
       <w:lvlJc w:val="left"/>
     </w:lvl>
-    <w:lvl w:ilvl="5" w:tplc="B314A7CC">
+    <w:lvl w:ilvl="5" w:tplc="965E0D88">
       <w:numFmt w:val="decimal"/>
       <w:lvlText w:val=""/>
       <w:lvlJc w:val="left"/>
     </w:lvl>
-    <w:lvl w:ilvl="6" w:tplc="DE7CD3F4">
+    <w:lvl w:ilvl="6" w:tplc="6B6466B0">
       <w:numFmt w:val="decimal"/>
       <w:lvlText w:val=""/>
       <w:lvlJc w:val="left"/>
     </w:lvl>
-    <w:lvl w:ilvl="7" w:tplc="EA485A62">
+    <w:lvl w:ilvl="7" w:tplc="F434FD06">
       <w:numFmt w:val="decimal"/>
       <w:lvlText w:val=""/>
       <w:lvlJc w:val="left"/>
     </w:lvl>
-    <w:lvl w:ilvl="8" w:tplc="E7683AB2">
-      <w:numFmt w:val="decimal"/>
-      <w:lvlText w:val=""/>
-      <w:lvlJc w:val="left"/>
-    </w:lvl>
-  </w:abstractNum>
-  <w:abstractNum w:abstractNumId="3" w15:restartNumberingAfterBreak="0">
-    <w:nsid w:val="31681F89"/>
-    <w:multiLevelType w:val="hybridMultilevel"/>
-    <w:tmpl w:val="13749140"/>
-    <w:lvl w:ilvl="0" w:tplc="CF685782">
-      <w:start w:val="1"/>
-      <w:numFmt w:val="decimal"/>
-      <w:lvlText w:val="[%1]"/>
-      <w:lvlJc w:val="left"/>
-      <w:pPr>
-        <w:ind w:left="600" w:hanging="420"/>
-      </w:pPr>
-    </w:lvl>
-    <w:lvl w:ilvl="1" w:tplc="82A6B60C">
-      <w:numFmt w:val="decimal"/>
-      <w:lvlText w:val=""/>
-      <w:lvlJc w:val="left"/>
-    </w:lvl>
-    <w:lvl w:ilvl="2" w:tplc="7EE459E8">
-      <w:numFmt w:val="decimal"/>
-      <w:lvlText w:val=""/>
-      <w:lvlJc w:val="left"/>
-    </w:lvl>
-    <w:lvl w:ilvl="3" w:tplc="9168CFCE">
-      <w:numFmt w:val="decimal"/>
-      <w:lvlText w:val=""/>
-      <w:lvlJc w:val="left"/>
-    </w:lvl>
-    <w:lvl w:ilvl="4" w:tplc="BC9E9DE6">
-      <w:numFmt w:val="decimal"/>
-      <w:lvlText w:val=""/>
-      <w:lvlJc w:val="left"/>
-    </w:lvl>
-    <w:lvl w:ilvl="5" w:tplc="213C6E4E">
-      <w:numFmt w:val="decimal"/>
-      <w:lvlText w:val=""/>
-      <w:lvlJc w:val="left"/>
-    </w:lvl>
-    <w:lvl w:ilvl="6" w:tplc="2592D658">
-      <w:numFmt w:val="decimal"/>
-      <w:lvlText w:val=""/>
-      <w:lvlJc w:val="left"/>
-    </w:lvl>
-    <w:lvl w:ilvl="7" w:tplc="88ACC55E">
-      <w:numFmt w:val="decimal"/>
-      <w:lvlText w:val=""/>
-      <w:lvlJc w:val="left"/>
-    </w:lvl>
-    <w:lvl w:ilvl="8" w:tplc="2D5C9FEC">
+    <w:lvl w:ilvl="8" w:tplc="741A6458">
       <w:numFmt w:val="decimal"/>
       <w:lvlText w:val=""/>
       <w:lvlJc w:val="left"/>
     </w:lvl>
   </w:abstractNum>
   <w:abstractNum w:abstractNumId="4" w15:restartNumberingAfterBreak="0">
-    <w:nsid w:val="337674FC"/>
+    <w:nsid w:val="68D4616A"/>
     <w:multiLevelType w:val="hybridMultilevel"/>
-    <w:tmpl w:val="7258167A"/>
-    <w:lvl w:ilvl="0" w:tplc="87D46122">
+    <w:tmpl w:val="EEF4CF40"/>
+    <w:lvl w:ilvl="0" w:tplc="46F0C646">
       <w:start w:val="1"/>
       <w:numFmt w:val="decimal"/>
       <w:lvlText w:val="%1."/>
@@ -17731,67 +17731,67 @@
         <w:ind w:left="600" w:hanging="420"/>
       </w:pPr>
     </w:lvl>
-    <w:lvl w:ilvl="1" w:tplc="C400EFFC">
+    <w:lvl w:ilvl="1" w:tplc="0396F610">
       <w:numFmt w:val="decimal"/>
       <w:lvlText w:val=""/>
       <w:lvlJc w:val="left"/>
     </w:lvl>
-    <w:lvl w:ilvl="2" w:tplc="50BE1FC0">
+    <w:lvl w:ilvl="2" w:tplc="6180C328">
       <w:numFmt w:val="decimal"/>
       <w:lvlText w:val=""/>
       <w:lvlJc w:val="left"/>
     </w:lvl>
-    <w:lvl w:ilvl="3" w:tplc="86A62EDC">
+    <w:lvl w:ilvl="3" w:tplc="7CDC6D1A">
       <w:numFmt w:val="decimal"/>
       <w:lvlText w:val=""/>
       <w:lvlJc w:val="left"/>
     </w:lvl>
-    <w:lvl w:ilvl="4" w:tplc="06402F92">
+    <w:lvl w:ilvl="4" w:tplc="00647394">
       <w:numFmt w:val="decimal"/>
       <w:lvlText w:val=""/>
       <w:lvlJc w:val="left"/>
     </w:lvl>
-    <w:lvl w:ilvl="5" w:tplc="61F68E2E">
+    <w:lvl w:ilvl="5" w:tplc="8F56818C">
       <w:numFmt w:val="decimal"/>
       <w:lvlText w:val=""/>
       <w:lvlJc w:val="left"/>
     </w:lvl>
-    <w:lvl w:ilvl="6" w:tplc="E6BC47B0">
+    <w:lvl w:ilvl="6" w:tplc="3C948A92">
       <w:numFmt w:val="decimal"/>
       <w:lvlText w:val=""/>
       <w:lvlJc w:val="left"/>
     </w:lvl>
-    <w:lvl w:ilvl="7" w:tplc="7A5201C4">
+    <w:lvl w:ilvl="7" w:tplc="93EA2258">
       <w:numFmt w:val="decimal"/>
       <w:lvlText w:val=""/>
       <w:lvlJc w:val="left"/>
     </w:lvl>
-    <w:lvl w:ilvl="8" w:tplc="02CCCC6E">
+    <w:lvl w:ilvl="8" w:tplc="0F5A704A">
       <w:numFmt w:val="decimal"/>
       <w:lvlText w:val=""/>
       <w:lvlJc w:val="left"/>
     </w:lvl>
   </w:abstractNum>
-  <w:num w:numId="1" w16cid:durableId="1068578338">
+  <w:num w:numId="1" w16cid:durableId="687173133">
+    <w:abstractNumId w:val="0"/>
+    <w:lvlOverride w:ilvl="0">
+      <w:startOverride w:val="1"/>
+    </w:lvlOverride>
+  </w:num>
+  <w:num w:numId="2" w16cid:durableId="249898242">
+    <w:abstractNumId w:val="3"/>
+    <w:lvlOverride w:ilvl="0">
+      <w:startOverride w:val="1"/>
+    </w:lvlOverride>
+  </w:num>
+  <w:num w:numId="3" w16cid:durableId="337731444">
     <w:abstractNumId w:val="1"/>
     <w:lvlOverride w:ilvl="0">
       <w:startOverride w:val="1"/>
     </w:lvlOverride>
   </w:num>
-  <w:num w:numId="2" w16cid:durableId="2058822581">
+  <w:num w:numId="4" w16cid:durableId="963117609">
     <w:abstractNumId w:val="2"/>
-    <w:lvlOverride w:ilvl="0">
-      <w:startOverride w:val="1"/>
-    </w:lvlOverride>
-  </w:num>
-  <w:num w:numId="3" w16cid:durableId="346442653">
-    <w:abstractNumId w:val="0"/>
-    <w:lvlOverride w:ilvl="0">
-      <w:startOverride w:val="1"/>
-    </w:lvlOverride>
-  </w:num>
-  <w:num w:numId="4" w16cid:durableId="880508293">
-    <w:abstractNumId w:val="3"/>
     <w:lvlOverride w:ilvl="0">
       <w:startOverride w:val="1"/>
     </w:lvlOverride>
@@ -18410,7 +18410,7 @@
     <w:autoRedefine/>
     <w:uiPriority w:val="39"/>
     <w:unhideWhenUsed/>
-    <w:rsid w:val="00E21E53"/>
+    <w:rsid w:val="00391209"/>
     <w:pPr>
       <w:spacing w:after="100"/>
     </w:pPr>
@@ -18422,7 +18422,7 @@
     <w:autoRedefine/>
     <w:uiPriority w:val="39"/>
     <w:unhideWhenUsed/>
-    <w:rsid w:val="00E21E53"/>
+    <w:rsid w:val="00391209"/>
     <w:pPr>
       <w:spacing w:after="100"/>
       <w:ind w:left="240"/>

</xml_diff>